<commit_message>
📝 docs: add BERTopic weak labeling pipeline paragraph to SetFit explainer
</commit_message>
<xml_diff>
--- a/docs/setfit_few_shot_contrastive_learning.docx
+++ b/docs/setfit_few_shot_contrastive_learning.docx
@@ -29,6 +29,14 @@
       </w:r>
       <w:r>
         <w:t xml:space="preserve">because the pair labels are derived automatically from class labels, but the correct characterization is few-shot contrastive learning — it requires labeled data and does not use masking or pretext tasks on unlabeled corpora. SetFit achieves accuracy competitive with GPT-3 on few-shot benchmarks while using only an 80M-parameter model and minutes of training time (Tunstall et al., 2022, arXiv:2209.11055).</w:t>
+      </w:r>
+    </w:p>
+    <w:p>
+      <w:pPr>
+        <w:pStyle w:val="BodyText"/>
+      </w:pPr>
+      <w:r>
+        <w:t xml:space="preserve">A practical labeling pipeline for SetFit begins with unsupervised topic discovery using BERTopic on a large corpus (1M+ documents) to surface latent topics and their representative keywords. These keywords then drive a weak labeling step — for example, using AWK to bucket texts into hand-assigned classes based on keyword presence — producing a compact, labeled subset at scale without manual annotation of every document. The resulting labeled data serves as both the few-shot training set for SetFit’s contrastive fine-tuning and a held-out validation set for evaluation. This strategy is effective because it combines the breadth of unsupervised discovery with the precision of human-defined class boundaries, and SetFit’s contrastive learning then generalises well beyond exact keyword matches, yielding a robust classifier from minimal labeled examples.</w:t>
       </w:r>
     </w:p>
     <w:bookmarkEnd w:id="9"/>

</xml_diff>